<commit_message>
Add old-vs-new assessment-logic figure to scenario-call one-pager
Two-panel figure: (A) current logic with EC projections (WEM/WAM) and
EC-scenario benchmarks only; (B) new logic where the open scenario call
adds the modelled scientific landscape as a quantile fan (5-95% and
25-75% bands with median) computed from the 63 EU27 runs bundled in
src/data/scenarios.ts, so EC benchmarks become testable against the
ensemble range. Figure embedded in the one-pager; layout tightened to
keep it on one page.

https://claude.ai/code/session_017E2LLU51vN56wQXoUnM1vJ
</commit_message>
<xml_diff>
--- a/project-documents/2026-06-12 Scenario Submission Call - One-pager.docx
+++ b/project-documents/2026-06-12 Scenario Submission Call - One-pager.docx
@@ -31,13 +31,13 @@
     </w:p>
     <w:p>
       <w:pPr>
-        <w:spacing w:before="120" w:after="40"/>
+        <w:spacing w:before="80" w:after="20"/>
       </w:pPr>
       <w:r>
         <w:rPr>
           <w:b/>
           <w:color w:val="2F6E5B"/>
-          <w:sz w:val="21"/>
+          <w:sz w:val="20"/>
         </w:rPr>
         <w:t>What do we need scenarios for?</w:t>
       </w:r>
@@ -46,20 +46,20 @@
       <w:r>
         <w:rPr>
           <w:i w:val="0"/>
-          <w:sz w:val="19"/>
+          <w:sz w:val="18"/>
         </w:rPr>
-        <w:t>Our monitoring frameworks tell us what to track but not how fast it must move. The advisory board's sector flow charts (Figures 12–64 of 'Towards EU climate neutrality') carry ~40 progress indicators; today these are read against observed trends only. Matched scenario corridors turn every indicator into a quantified benchmark — is solar deployment, renovation, or the cattle herd inside the corridor that EU-climate-neutrality pathways require? — and keep our gap assessments evidence-based as policy and model vintages evolve.</w:t>
+        <w:t>Our monitoring frameworks tell us what to track but not how fast it must move. The board's sector flow charts carry ~40 progress indicators, today read against observed trends and EC scenarios only. Matched scenario corridors turn every indicator into a quantified benchmark and keep gap assessments evidence-based as policy and model vintages evolve.</w:t>
       </w:r>
     </w:p>
     <w:p>
       <w:pPr>
-        <w:spacing w:before="120" w:after="40"/>
+        <w:spacing w:before="80" w:after="20"/>
       </w:pPr>
       <w:r>
         <w:rPr>
           <w:b/>
           <w:color w:val="2F6E5B"/>
-          <w:sz w:val="21"/>
+          <w:sz w:val="20"/>
         </w:rPr>
         <w:t>Which options do we have to acquire them?</w:t>
       </w:r>
@@ -67,69 +67,123 @@
     <w:p>
       <w:pPr>
         <w:pStyle w:val="ListBullet"/>
-        <w:spacing w:after="30"/>
+        <w:spacing w:after="20"/>
       </w:pPr>
       <w:r>
         <w:rPr>
           <w:b/>
-          <w:sz w:val="19"/>
+          <w:sz w:val="18"/>
         </w:rPr>
         <w:t xml:space="preserve">Reuse existing databases — </w:t>
       </w:r>
       <w:r>
         <w:rPr>
-          <w:sz w:val="19"/>
+          <w:sz w:val="18"/>
         </w:rPr>
-        <w:t>AR6 / ECEMF / Scenario Explorer snapshots. Cheap, but vintages age, EU27 sectoral detail is thin, and we cannot ask for missing variables.</w:t>
+        <w:t>AR6 / ECEMF snapshots — cheap, but vintages age, EU27 sectoral detail is thin, and we cannot ask for missing variables.</w:t>
       </w:r>
     </w:p>
     <w:p>
       <w:pPr>
         <w:pStyle w:val="ListBullet"/>
-        <w:spacing w:after="30"/>
+        <w:spacing w:after="20"/>
       </w:pPr>
       <w:r>
         <w:rPr>
           <w:b/>
-          <w:sz w:val="19"/>
+          <w:sz w:val="18"/>
         </w:rPr>
         <w:t xml:space="preserve">Commission modelling — </w:t>
       </w:r>
       <w:r>
         <w:rPr>
-          <w:sz w:val="19"/>
+          <w:sz w:val="18"/>
         </w:rPr>
-        <w:t>Full control over scenario design, but slow, costly, and yields few models — weak ensembles and a perception of hand-picked evidence.</w:t>
+        <w:t>Full design control, but slow, costly, few models — weak ensembles, hand-picked look.</w:t>
       </w:r>
     </w:p>
     <w:p>
       <w:pPr>
         <w:pStyle w:val="ListBullet"/>
-        <w:spacing w:after="30"/>
+        <w:spacing w:after="20"/>
       </w:pPr>
       <w:r>
         <w:rPr>
           <w:b/>
-          <w:sz w:val="19"/>
+          <w:sz w:val="18"/>
         </w:rPr>
         <w:t xml:space="preserve">Open submission call (proposed) — </w:t>
       </w:r>
       <w:r>
         <w:rPr>
-          <w:sz w:val="19"/>
+          <w:sz w:val="18"/>
         </w:rPr>
-        <w:t>Invite IAM and sectoral modelling teams to submit economy-wide or sectoral EU scenarios directly to the MethodHub. Best ensemble breadth and freshness at the lowest cost; the other two options remain available as fallback and complement.</w:t>
+        <w:t>IAM and sectoral teams submit economy-wide or sectoral EU scenarios directly to the MethodHub — best breadth and freshness at the lowest cost; the other options stay as complements.</w:t>
       </w:r>
     </w:p>
     <w:p>
       <w:pPr>
-        <w:spacing w:before="120" w:after="40"/>
+        <w:spacing w:before="60" w:after="0"/>
+        <w:jc w:val="center"/>
+      </w:pPr>
+      <w:r>
+        <w:drawing>
+          <wp:inline xmlns:a="http://schemas.openxmlformats.org/drawingml/2006/main" xmlns:pic="http://schemas.openxmlformats.org/drawingml/2006/picture">
+            <wp:extent cx="6048000" cy="3740211"/>
+            <wp:docPr id="1" name="Picture 1"/>
+            <wp:cNvGraphicFramePr>
+              <a:graphicFrameLocks noChangeAspect="1"/>
+            </wp:cNvGraphicFramePr>
+            <a:graphic>
+              <a:graphicData uri="http://schemas.openxmlformats.org/drawingml/2006/picture">
+                <pic:pic>
+                  <pic:nvPicPr>
+                    <pic:cNvPr id="0" name="scenario-call-logic-figure.png"/>
+                    <pic:cNvPicPr/>
+                  </pic:nvPicPr>
+                  <pic:blipFill>
+                    <a:blip r:embed="rId9"/>
+                    <a:stretch>
+                      <a:fillRect/>
+                    </a:stretch>
+                  </pic:blipFill>
+                  <pic:spPr>
+                    <a:xfrm>
+                      <a:off x="0" y="0"/>
+                      <a:ext cx="6048000" cy="3740211"/>
+                    </a:xfrm>
+                    <a:prstGeom prst="rect"/>
+                  </pic:spPr>
+                </pic:pic>
+              </a:graphicData>
+            </a:graphic>
+          </wp:inline>
+        </w:drawing>
+      </w:r>
+    </w:p>
+    <w:p>
+      <w:pPr>
+        <w:spacing w:after="60"/>
+        <w:jc w:val="center"/>
+      </w:pPr>
+      <w:r>
+        <w:rPr>
+          <w:i/>
+          <w:color w:val="555B63"/>
+          <w:sz w:val="15"/>
+        </w:rPr>
+        <w:t>Current vs new assessment logic. (A) Today: projections and future benchmarks come from EC scenarios alone — a single source with no uncertainty range. (B) With the open call, the submitted ensemble (here: the 63 EU27 runs from 9 IAMs already held, shown as 5–95% and 25–75% quantile bands with the median) places the EC trajectory in the broader scientific landscape, so benchmarks that are too optimistic or pessimistic become visible.</w:t>
+      </w:r>
+    </w:p>
+    <w:p>
+      <w:pPr>
+        <w:spacing w:before="80" w:after="20"/>
       </w:pPr>
       <w:r>
         <w:rPr>
           <w:b/>
           <w:color w:val="2F6E5B"/>
-          <w:sz w:val="21"/>
+          <w:sz w:val="20"/>
         </w:rPr>
         <w:t>What would the workflow be on our side?</w:t>
       </w:r>
@@ -137,88 +191,88 @@
     <w:p>
       <w:pPr>
         <w:pStyle w:val="ListBullet"/>
-        <w:spacing w:after="30"/>
+        <w:spacing w:after="20"/>
       </w:pPr>
       <w:r>
         <w:rPr>
           <w:b/>
-          <w:sz w:val="19"/>
+          <w:sz w:val="18"/>
         </w:rPr>
         <w:t xml:space="preserve">Submission infrastructure — </w:t>
       </w:r>
       <w:r>
         <w:rPr>
-          <w:sz w:val="19"/>
+          <w:sz w:val="18"/>
         </w:rPr>
-        <w:t>Built on the MethodHub, which already bundles a Scenario Explorer snapshot (63 EU27 runs from 9 model versions) and the indicator database. Teams submit IAMC-template files through a portal; no new platform is needed.</w:t>
+        <w:t>Built on the MethodHub, which already bundles the scenario snapshot and the indicator database; teams submit IAMC-template files through a portal — no new platform needed.</w:t>
       </w:r>
     </w:p>
     <w:p>
       <w:pPr>
         <w:pStyle w:val="ListBullet"/>
-        <w:spacing w:after="30"/>
+        <w:spacing w:after="20"/>
       </w:pPr>
       <w:r>
         <w:rPr>
           <w:b/>
-          <w:sz w:val="19"/>
+          <w:sz w:val="18"/>
         </w:rPr>
         <w:t xml:space="preserve">Automated matching — </w:t>
       </w:r>
       <w:r>
         <w:rPr>
-          <w:sz w:val="19"/>
+          <w:sz w:val="18"/>
         </w:rPr>
-        <w:t>Each submitted run is resolved against the indicator framework — a prototype flow chart ('Scenario call — IAM-matched indicators') already maps every indicator of the default board to an IAMC variable and submission track (economy-wide / sectoral / new variable requested).</w:t>
+        <w:t>A prototype flow chart ('Scenario call') already maps every indicator — mitigation and adaptation — to a template variable and submission track; submitted runs resolve against it automatically.</w:t>
       </w:r>
     </w:p>
     <w:p>
       <w:pPr>
         <w:pStyle w:val="ListBullet"/>
-        <w:spacing w:after="30"/>
+        <w:spacing w:after="20"/>
       </w:pPr>
       <w:r>
         <w:rPr>
           <w:b/>
-          <w:sz w:val="19"/>
+          <w:sz w:val="18"/>
         </w:rPr>
         <w:t xml:space="preserve">Filtering &amp; analysis — </w:t>
       </w:r>
       <w:r>
         <w:rPr>
-          <w:sz w:val="19"/>
+          <w:sz w:val="18"/>
         </w:rPr>
-        <w:t>A fully-fledged vetting, filtering and corridor-analysis toolset is built into the MethodHub pipeline (harmonisation diagnostics as used for the existing snapshot), so screening submissions is largely automatic.</w:t>
+        <w:t>Vetting, filtering and corridor analysis run in the existing MethodHub pipeline (harmonisation diagnostics as used for the current snapshot).</w:t>
       </w:r>
     </w:p>
     <w:p>
       <w:pPr>
         <w:pStyle w:val="ListBullet"/>
-        <w:spacing w:after="30"/>
+        <w:spacing w:after="20"/>
       </w:pPr>
       <w:r>
         <w:rPr>
           <w:b/>
-          <w:sz w:val="19"/>
+          <w:sz w:val="18"/>
         </w:rPr>
         <w:t xml:space="preserve">Distribution — </w:t>
       </w:r>
       <w:r>
         <w:rPr>
-          <w:sz w:val="19"/>
+          <w:sz w:val="18"/>
         </w:rPr>
-        <w:t>The main genuine effort. With two leading IAM modellers on the board — Keywan Riahi (MESSAGEix-GLOBIOM, IIASA) and Detlef van Vuuren (IMAGE, PBL) — the call travels through the IAMC, ECEMF and NAVIGATE/ENGAGE networks at essentially no cost and with high credibility.</w:t>
+        <w:t>The main genuine effort. With Keywan Riahi (MESSAGEix-GLOBIOM, IIASA) and Detlef van Vuuren (IMAGE, PBL) on the board, the call travels through the IAMC, ECEMF and NAVIGATE/ENGAGE networks at essentially no cost and with high credibility.</w:t>
       </w:r>
     </w:p>
     <w:p>
       <w:pPr>
-        <w:spacing w:before="120" w:after="40"/>
+        <w:spacing w:before="80" w:after="20"/>
       </w:pPr>
       <w:r>
         <w:rPr>
           <w:b/>
           <w:color w:val="2F6E5B"/>
-          <w:sz w:val="21"/>
+          <w:sz w:val="20"/>
         </w:rPr>
         <w:t>Benefits</w:t>
       </w:r>
@@ -226,88 +280,69 @@
     <w:p>
       <w:pPr>
         <w:pStyle w:val="ListBullet"/>
-        <w:spacing w:after="30"/>
+        <w:spacing w:after="20"/>
       </w:pPr>
       <w:r>
         <w:rPr>
           <w:b/>
-          <w:sz w:val="19"/>
+          <w:sz w:val="18"/>
         </w:rPr>
-        <w:t xml:space="preserve">Quantified monitoring — </w:t>
+        <w:t xml:space="preserve">Quantified, independent monitoring — </w:t>
       </w:r>
       <w:r>
         <w:rPr>
-          <w:sz w:val="19"/>
+          <w:sz w:val="18"/>
         </w:rPr>
-        <w:t>Every indicator gains a scenario corridor; assessments shift from directional to quantitative, continuously refreshable.</w:t>
+        <w:t>Every indicator gains a scenario corridor, and EC scenarios can be assessed against the broader scientific landscape (see figure).</w:t>
       </w:r>
     </w:p>
     <w:p>
       <w:pPr>
         <w:pStyle w:val="ListBullet"/>
-        <w:spacing w:after="30"/>
+        <w:spacing w:after="20"/>
       </w:pPr>
       <w:r>
         <w:rPr>
           <w:b/>
-          <w:sz w:val="19"/>
+          <w:sz w:val="18"/>
         </w:rPr>
-        <w:t xml:space="preserve">Broader, fresher evidence — </w:t>
+        <w:t xml:space="preserve">Broader, fresher evidence at low cost — </w:t>
       </w:r>
       <w:r>
         <w:rPr>
-          <w:sz w:val="19"/>
+          <w:sz w:val="18"/>
         </w:rPr>
-        <w:t>An open ensemble across many teams beats any single commissioned study; sectoral submissions (fleet, building-stock, agro-economic models) fill known IAM blind spots such as renovation rates, mode shares and livestock intensities.</w:t>
+        <w:t>An open multi-team ensemble beats any single study; sectoral submissions fill IAM blind spots (renovation rates, mode shares, livestock intensities); tooling is an extension of existing infrastructure.</w:t>
       </w:r>
     </w:p>
     <w:p>
       <w:pPr>
         <w:pStyle w:val="ListBullet"/>
-        <w:spacing w:after="30"/>
+        <w:spacing w:after="20"/>
       </w:pPr>
       <w:r>
         <w:rPr>
           <w:b/>
-          <w:sz w:val="19"/>
-        </w:rPr>
-        <w:t xml:space="preserve">Low marginal cost — </w:t>
-      </w:r>
-      <w:r>
-        <w:rPr>
-          <w:sz w:val="19"/>
-        </w:rPr>
-        <w:t>Tooling is an extension of existing MethodHub infrastructure; modellers' incentive is visibility of their scenarios in advisory-board assessments.</w:t>
-      </w:r>
-    </w:p>
-    <w:p>
-      <w:pPr>
-        <w:pStyle w:val="ListBullet"/>
-        <w:spacing w:after="30"/>
-      </w:pPr>
-      <w:r>
-        <w:rPr>
-          <w:b/>
-          <w:sz w:val="19"/>
+          <w:sz w:val="18"/>
         </w:rPr>
         <w:t xml:space="preserve">Transparency — </w:t>
       </w:r>
       <w:r>
         <w:rPr>
-          <w:sz w:val="19"/>
+          <w:sz w:val="18"/>
         </w:rPr>
-        <w:t>A documented, open call with published criteria strengthens the board's independence compared with selecting scenarios ad hoc.</w:t>
+        <w:t>A documented open call with published criteria strengthens the board's independence over ad-hoc scenario selection.</w:t>
       </w:r>
     </w:p>
     <w:p>
       <w:pPr>
-        <w:spacing w:before="120" w:after="40"/>
+        <w:spacing w:before="80" w:after="20"/>
       </w:pPr>
       <w:r>
         <w:rPr>
           <w:b/>
           <w:color w:val="2F6E5B"/>
-          <w:sz w:val="21"/>
+          <w:sz w:val="20"/>
         </w:rPr>
         <w:t>Risks — and why they are manageable</w:t>
       </w:r>
@@ -315,88 +350,69 @@
     <w:p>
       <w:pPr>
         <w:pStyle w:val="ListBullet"/>
-        <w:spacing w:after="30"/>
+        <w:spacing w:after="20"/>
       </w:pPr>
       <w:r>
         <w:rPr>
           <w:b/>
-          <w:sz w:val="19"/>
+          <w:sz w:val="18"/>
         </w:rPr>
         <w:t xml:space="preserve">Low or skewed response — </w:t>
       </w:r>
       <w:r>
         <w:rPr>
-          <w:sz w:val="19"/>
+          <w:sz w:val="18"/>
         </w:rPr>
-        <w:t>The central risk. Mitigated by the boards' network distribution, a low submission burden (standard IAMC template), and seeding the database with the 63 runs we already hold so the tool is useful from day one.</w:t>
+        <w:t>The central risk — mitigated by network distribution, a low submission burden (standard IAMC template), and seeding with the 63 runs already held so the tool works from day one.</w:t>
       </w:r>
     </w:p>
     <w:p>
       <w:pPr>
         <w:pStyle w:val="ListBullet"/>
-        <w:spacing w:after="30"/>
+        <w:spacing w:after="20"/>
       </w:pPr>
       <w:r>
         <w:rPr>
           <w:b/>
-          <w:sz w:val="19"/>
+          <w:sz w:val="18"/>
         </w:rPr>
         <w:t xml:space="preserve">Quality and comparability — </w:t>
       </w:r>
       <w:r>
         <w:rPr>
-          <w:sz w:val="19"/>
+          <w:sz w:val="18"/>
         </w:rPr>
-        <w:t>Mitigated by automated vetting and harmonisation diagnostics, plus published inclusion criteria; submission does not imply endorsement.</w:t>
+        <w:t>Automated vetting and harmonisation diagnostics plus published inclusion criteria; submission does not imply endorsement.</w:t>
       </w:r>
     </w:p>
     <w:p>
       <w:pPr>
         <w:pStyle w:val="ListBullet"/>
-        <w:spacing w:after="30"/>
+        <w:spacing w:after="20"/>
       </w:pPr>
       <w:r>
         <w:rPr>
           <w:b/>
-          <w:sz w:val="19"/>
+          <w:sz w:val="18"/>
         </w:rPr>
         <w:t xml:space="preserve">Coverage gaps — </w:t>
       </w:r>
       <w:r>
         <w:rPr>
-          <w:sz w:val="19"/>
+          <w:sz w:val="18"/>
         </w:rPr>
-        <w:t>Some indicators (circular material use, food waste, first-generation biofuel shares) are not standard outputs; the call flags them as requested variables and the sectoral track recruits the models that can report them.</w:t>
+        <w:t>Non-standard outputs (circular material use, food waste, renovation equity) are flagged as requested variables; the sectoral and impact-model tracks recruit the teams that can report them.</w:t>
       </w:r>
     </w:p>
     <w:p>
       <w:pPr>
-        <w:pStyle w:val="ListBullet"/>
-        <w:spacing w:after="30"/>
-      </w:pPr>
-      <w:r>
-        <w:rPr>
-          <w:b/>
-          <w:sz w:val="19"/>
-        </w:rPr>
-        <w:t xml:space="preserve">Process cost — </w:t>
-      </w:r>
-      <w:r>
-        <w:rPr>
-          <w:sz w:val="19"/>
-        </w:rPr>
-        <w:t>Concentrated in distribution and follow-up rather than in engineering — a bounded, plannable effort for the secretariat.</w:t>
-      </w:r>
-    </w:p>
-    <w:p>
-      <w:pPr>
-        <w:spacing w:before="120" w:after="40"/>
+        <w:spacing w:before="80" w:after="20"/>
       </w:pPr>
       <w:r>
         <w:rPr>
           <w:b/>
           <w:color w:val="2F6E5B"/>
-          <w:sz w:val="21"/>
+          <w:sz w:val="20"/>
         </w:rPr>
         <w:t>Bottom line</w:t>
       </w:r>
@@ -405,14 +421,14 @@
       <w:r>
         <w:rPr>
           <w:i w:val="0"/>
-          <w:sz w:val="19"/>
+          <w:sz w:val="18"/>
         </w:rPr>
-        <w:t>The call is feasible with modest effort: the infrastructure and analysis tooling can be delivered on the MethodHub, the indicator matching already exists in prototype, and the one real success factor — that teams actually submit — is exactly where the board is strongest, through Keywan's and Detlef's networks. We propose preparing a pilot call for autumn 2026.</w:t>
+        <w:t>Feasible with modest effort: infrastructure and analysis tooling are deliverable on the MethodHub, indicator matching exists in prototype, and the one real success factor — that teams submit — is where the board is strongest, through Keywan's and Detlef's networks. We propose preparing a pilot call for autumn 2026.</w:t>
       </w:r>
     </w:p>
     <w:sectPr>
       <w:pgSz w:w="12240" w:h="15840"/>
-      <w:pgMar w:top="794" w:right="1020" w:bottom="680" w:left="1020" w:header="720" w:footer="720" w:gutter="0"/>
+      <w:pgMar w:top="624" w:right="850" w:bottom="567" w:left="850" w:header="720" w:footer="720" w:gutter="0"/>
       <w:cols w:space="720"/>
       <w:docGrid w:linePitch="360"/>
     </w:sectPr>
@@ -784,11 +800,11 @@
     <w:qFormat/>
     <w:rsid w:val="00FC693F"/>
     <w:pPr>
-      <w:spacing w:after="60"/>
+      <w:spacing w:after="40"/>
     </w:pPr>
     <w:rPr>
       <w:rFonts w:ascii="Calibri" w:hAnsi="Calibri"/>
-      <w:sz w:val="19"/>
+      <w:sz w:val="18"/>
     </w:rPr>
   </w:style>
   <w:style w:type="paragraph" w:styleId="Header">

</xml_diff>

<commit_message>
Restyle scenario-call figure to journal conventions; add figure-explainer section
- Figure: single full-range band + median line instead of quantile fan;
  Nature-style formatting (Arial, lowercase bold panel letters a/b,
  outward ticks, minimal spines, muted print-safe palette, n stated in
  the legend)
- One-pager: 'What the figure shows' section below Figure 1 explaining
  panel a (single source, no range), panel b (ensemble band + median as
  independent check) and why it matters per indicator; caption slimmed

https://claude.ai/code/session_017E2LLU51vN56wQXoUnM1vJ
</commit_message>
<xml_diff>
--- a/project-documents/2026-06-12 Scenario Submission Call - One-pager.docx
+++ b/project-documents/2026-06-12 Scenario Submission Call - One-pager.docx
@@ -129,7 +129,7 @@
       <w:r>
         <w:drawing>
           <wp:inline xmlns:a="http://schemas.openxmlformats.org/drawingml/2006/main" xmlns:pic="http://schemas.openxmlformats.org/drawingml/2006/picture">
-            <wp:extent cx="6048000" cy="3740211"/>
+            <wp:extent cx="5832000" cy="3942761"/>
             <wp:docPr id="1" name="Picture 1"/>
             <wp:cNvGraphicFramePr>
               <a:graphicFrameLocks noChangeAspect="1"/>
@@ -150,7 +150,7 @@
                   <pic:spPr>
                     <a:xfrm>
                       <a:off x="0" y="0"/>
-                      <a:ext cx="6048000" cy="3740211"/>
+                      <a:ext cx="5832000" cy="3942761"/>
                     </a:xfrm>
                     <a:prstGeom prst="rect"/>
                   </pic:spPr>
@@ -163,7 +163,7 @@
     </w:p>
     <w:p>
       <w:pPr>
-        <w:spacing w:after="60"/>
+        <w:spacing w:after="40"/>
         <w:jc w:val="center"/>
       </w:pPr>
       <w:r>
@@ -172,7 +172,77 @@
           <w:color w:val="555B63"/>
           <w:sz w:val="15"/>
         </w:rPr>
-        <w:t>Current vs new assessment logic. (A) Today: projections and future benchmarks come from EC scenarios alone — a single source with no uncertainty range. (B) With the open call, the submitted ensemble (here: the 63 EU27 runs from 9 IAMs already held, shown as 5–95% and 25–75% quantile bands with the median) places the EC trajectory in the broader scientific landscape, so benchmarks that are too optimistic or pessimistic become visible.</w:t>
+        <w:t>Figure 1 | Current (a) vs new (b) assessment logic. Shading: full range across the 63 EU27 runs (9 IAMs) already held in the MethodHub; line: ensemble median.</w:t>
+      </w:r>
+    </w:p>
+    <w:p>
+      <w:pPr>
+        <w:spacing w:before="80" w:after="20"/>
+      </w:pPr>
+      <w:r>
+        <w:rPr>
+          <w:b/>
+          <w:color w:val="2F6E5B"/>
+          <w:sz w:val="20"/>
+        </w:rPr>
+        <w:t>What the figure shows</w:t>
+      </w:r>
+    </w:p>
+    <w:p>
+      <w:pPr>
+        <w:pStyle w:val="ListBullet"/>
+        <w:spacing w:after="20"/>
+      </w:pPr>
+      <w:r>
+        <w:rPr>
+          <w:b/>
+          <w:sz w:val="18"/>
+        </w:rPr>
+        <w:t xml:space="preserve">Panel a (today) — </w:t>
+      </w:r>
+      <w:r>
+        <w:rPr>
+          <w:sz w:val="18"/>
+        </w:rPr>
+        <w:t>Both forward-looking elements come from a single source: WEM/WAM projections answer 'will we meet the benchmark under current and planned policies?', the trend extrapolation answers 'what if we simply continue?', and the EC benchmarks set the goal posts. There is no independent check and no uncertainty range around any of them.</w:t>
+      </w:r>
+    </w:p>
+    <w:p>
+      <w:pPr>
+        <w:pStyle w:val="ListBullet"/>
+        <w:spacing w:after="20"/>
+      </w:pPr>
+      <w:r>
+        <w:rPr>
+          <w:b/>
+          <w:sz w:val="18"/>
+        </w:rPr>
+        <w:t xml:space="preserve">Panel b (with the call) — </w:t>
+      </w:r>
+      <w:r>
+        <w:rPr>
+          <w:sz w:val="18"/>
+        </w:rPr>
+        <w:t>Both elements are kept, but the submitted scenario ensemble is added alongside: the shaded band is the full range across all submitted runs, the solid line their median. Reading EC projections and benchmarks against this band shows at a glance where they sit in the scientific landscape — e.g. the 2030 benchmark lies at the upper edge of the modelled range, and by 2050 the ensemble explores net-negative territory the EC trajectory never reaches.</w:t>
+      </w:r>
+    </w:p>
+    <w:p>
+      <w:pPr>
+        <w:pStyle w:val="ListBullet"/>
+        <w:spacing w:after="20"/>
+      </w:pPr>
+      <w:r>
+        <w:rPr>
+          <w:b/>
+          <w:sz w:val="18"/>
+        </w:rPr>
+        <w:t xml:space="preserve">Why it matters — </w:t>
+      </w:r>
+      <w:r>
+        <w:rPr>
+          <w:sz w:val="18"/>
+        </w:rPr>
+        <w:t>The same comparison is repeated per indicator on the matched flow chart, giving every sector benchmark an independent, scientifically robust corridor — and a documented basis for judging whether EC scenarios are too optimistic or too pessimistic on specific points.</w:t>
       </w:r>
     </w:p>
     <w:p>

</xml_diff>

<commit_message>
Make scenario-call figure schematic with larger type
Replace the data-driven figure with an abstract schematic (unitless
'Variable' axis, no numbers): historic line, EC projection, EC
benchmarks, and in panel b a single shaded range band across submitted
scenarios with an ensemble median. Larger fonts throughout for
readability when embedded; legends moved into clear headroom. One-pager
caption and explainer reworded to match the schematic.

https://claude.ai/code/session_017E2LLU51vN56wQXoUnM1vJ
</commit_message>
<xml_diff>
--- a/project-documents/2026-06-12 Scenario Submission Call - One-pager.docx
+++ b/project-documents/2026-06-12 Scenario Submission Call - One-pager.docx
@@ -129,7 +129,7 @@
       <w:r>
         <w:drawing>
           <wp:inline xmlns:a="http://schemas.openxmlformats.org/drawingml/2006/main" xmlns:pic="http://schemas.openxmlformats.org/drawingml/2006/picture">
-            <wp:extent cx="5832000" cy="3942761"/>
+            <wp:extent cx="5832000" cy="4165714"/>
             <wp:docPr id="1" name="Picture 1"/>
             <wp:cNvGraphicFramePr>
               <a:graphicFrameLocks noChangeAspect="1"/>
@@ -150,7 +150,7 @@
                   <pic:spPr>
                     <a:xfrm>
                       <a:off x="0" y="0"/>
-                      <a:ext cx="5832000" cy="3942761"/>
+                      <a:ext cx="5832000" cy="4165714"/>
                     </a:xfrm>
                     <a:prstGeom prst="rect"/>
                   </pic:spPr>
@@ -172,7 +172,7 @@
           <w:color w:val="555B63"/>
           <w:sz w:val="15"/>
         </w:rPr>
-        <w:t>Figure 1 | Current (a) vs new (b) assessment logic. Shading: full range across the 63 EU27 runs (9 IAMs) already held in the MethodHub; line: ensemble median.</w:t>
+        <w:t>Figure 1 | Current (a) vs new (b) assessment logic (schematic). Shaded band: range across submitted scenarios; solid line: ensemble median.</w:t>
       </w:r>
     </w:p>
     <w:p>
@@ -223,7 +223,7 @@
         <w:rPr>
           <w:sz w:val="18"/>
         </w:rPr>
-        <w:t>Both elements are kept, but the submitted scenario ensemble is added alongside: the shaded band is the full range across all submitted runs, the solid line their median. Reading EC projections and benchmarks against this band shows at a glance where they sit in the scientific landscape — e.g. the 2030 benchmark lies at the upper edge of the modelled range, and by 2050 the ensemble explores net-negative territory the EC trajectory never reaches.</w:t>
+        <w:t>Both elements are kept, but the submitted scenario ensemble is added alongside: the shaded band is the range across all submitted runs, the solid line their median. Where the EC projection and benchmarks sit relative to the band shows at a glance whether they are optimistic or conservative against the scientific landscape — and the ensemble reveals futures (such as net-negative emissions) that a single EC trajectory never shows.</w:t>
       </w:r>
     </w:p>
     <w:p>

</xml_diff>

<commit_message>
Fix WEM/WAM attribution and switch figure example to industry emissions
WEM/WAM projections are Member State projections (reported under the
Governance Regulation, aggregated by the EEA), not EC scenarios — the
EC scenarios sit behind the benchmarks. Relabel the projection line and
panel-a title accordingly; annotation now reads 'official sources only —
no independent check, no range'. Example variable on the y-axis changed
from net GHG to industry GHG emissions; ensemble median approaches
(net) zero. One-pager explainer reworded to match.

https://claude.ai/code/session_017E2LLU51vN56wQXoUnM1vJ
</commit_message>
<xml_diff>
--- a/project-documents/2026-06-12 Scenario Submission Call - One-pager.docx
+++ b/project-documents/2026-06-12 Scenario Submission Call - One-pager.docx
@@ -204,7 +204,7 @@
         <w:rPr>
           <w:sz w:val="18"/>
         </w:rPr>
-        <w:t>Both forward-looking elements come from a single source: WEM/WAM projections answer 'will we meet the benchmark under current and planned policies?', the trend extrapolation answers 'what if we simply continue?', and the EC benchmarks set the goal posts. There is no independent check and no uncertainty range around any of them.</w:t>
+        <w:t>Both forward-looking elements come from official sources only: the Member State WEM/WAM projections (reported under the Governance Regulation, aggregated by the EEA) answer 'will we meet the benchmark under current and planned policies?', and the EC-scenario benchmarks set the goal posts. There is no independent scientific check and no uncertainty range around either.</w:t>
       </w:r>
     </w:p>
     <w:p>
@@ -223,7 +223,7 @@
         <w:rPr>
           <w:sz w:val="18"/>
         </w:rPr>
-        <w:t>Both elements are kept, but the submitted scenario ensemble is added alongside: the shaded band is the range across all submitted runs, the solid line their median. Where the EC projection and benchmarks sit relative to the band shows at a glance whether they are optimistic or conservative against the scientific landscape — and the ensemble reveals futures (such as net-negative emissions) that a single EC trajectory never shows.</w:t>
+        <w:t>Both elements are kept, but the submitted scenario ensemble is added alongside: the shaded band is the range across all submitted runs, the solid line their median. Where the official projections and benchmarks sit relative to the band shows at a glance whether they are optimistic or conservative against the scientific landscape — and the ensemble reveals futures (such as deeper-than-target cuts) that a single official trajectory never shows.</w:t>
       </w:r>
     </w:p>
     <w:p>

</xml_diff>

<commit_message>
Add transition-dynamics panel (c) and two-purposes framing
The call serves two purposes: (1) checking official projections and EC
benchmarks against the modelled range (panels a-b), and (2)
understanding the inherent dynamics of the transition (new panel c) —
the share of remaining effort deliverable by mature-technology roll-out
shrinks while the hard core (technology availability limits,
infrastructure, diets, consumption, demand) grows, which sectoral-model
submissions resolve bottom-up beyond the GHG headline. One-pager
restructured around the two purposes, with a transition-dynamics
benefit bullet and the user's current section wording adopted.

https://claude.ai/code/session_017E2LLU51vN56wQXoUnM1vJ
</commit_message>
<xml_diff>
--- a/project-documents/2026-06-12 Scenario Submission Call - One-pager.docx
+++ b/project-documents/2026-06-12 Scenario Submission Call - One-pager.docx
@@ -39,16 +39,45 @@
           <w:color w:val="2F6E5B"/>
           <w:sz w:val="20"/>
         </w:rPr>
-        <w:t>What do we need scenarios for?</w:t>
+        <w:t>What do we need scenarios for? Two sides of the same coin</w:t>
       </w:r>
     </w:p>
     <w:p>
+      <w:pPr>
+        <w:pStyle w:val="ListBullet"/>
+        <w:spacing w:after="20"/>
+      </w:pPr>
       <w:r>
         <w:rPr>
-          <w:i w:val="0"/>
+          <w:b/>
           <w:sz w:val="18"/>
         </w:rPr>
-        <w:t>Our monitoring frameworks tell us what to track but not how fast it must move. The board's sector flow charts carry ~40 progress indicators, today read against observed trends and EC scenarios only. Matched scenario corridors turn every indicator into a quantified benchmark and keep gap assessments evidence-based as policy and model vintages evolve.</w:t>
+        <w:t xml:space="preserve">Checking the benchmarks, adding context (Fig. 1a–b) — </w:t>
+      </w:r>
+      <w:r>
+        <w:rPr>
+          <w:sz w:val="18"/>
+        </w:rPr>
+        <w:t>Our monitoring frameworks tell us what to track but not how fast it must move. The advisory board's sector flow charts (Figures 12–64 of 'Towards EU climate neutrality') carry ~40 progress indicators; today these are read against observed trends, Member State WEM/WAM projections and EC benchmarks only. Matched scenario corridors turn every indicator into a quantified benchmark — is solar deployment, renovation, or the cattle herd inside the corridor that EU-climate-neutrality pathways require? — allow us to assess whether EC scenarios are too optimistic or too pessimistic against the broader scientific landscape, and keep our gap assessments evidence-based as policy and model vintages evolve.</w:t>
+      </w:r>
+    </w:p>
+    <w:p>
+      <w:pPr>
+        <w:pStyle w:val="ListBullet"/>
+        <w:spacing w:after="20"/>
+      </w:pPr>
+      <w:r>
+        <w:rPr>
+          <w:b/>
+          <w:sz w:val="18"/>
+        </w:rPr>
+        <w:t xml:space="preserve">Understanding the inherent dynamics of the transition (Fig. 1c) — </w:t>
+      </w:r>
+      <w:r>
+        <w:rPr>
+          <w:sz w:val="18"/>
+        </w:rPr>
+        <w:t>Meeting the 2030 target is not the same as being on track for 2050. Sectors bank the easy gains first — in energy, the low-hanging fruit of mature renewables roll-out. What remains is the hard core: structural and technological constraints (limited availability of CCS, hydrogen, critical materials, infrastructure) and major societal challenges (diets, consumption, demand). A call that includes sectoral modelling outputs builds a bottom-up view of these system dynamics, so we can see where we really stand beyond the headline GHG indicator — reading between the lines of apparent target compliance.</w:t>
       </w:r>
     </w:p>
     <w:p>
@@ -80,7 +109,7 @@
         <w:rPr>
           <w:sz w:val="18"/>
         </w:rPr>
-        <w:t>AR6 / ECEMF snapshots — cheap, but vintages age, EU27 sectoral detail is thin, and we cannot ask for missing variables.</w:t>
+        <w:t>AR6 / ECEMF / Scenario Explorer snapshots. Cheap, but vintages age, EU27 sectoral detail is thin, and we cannot ask for missing variables.</w:t>
       </w:r>
     </w:p>
     <w:p>
@@ -99,7 +128,7 @@
         <w:rPr>
           <w:sz w:val="18"/>
         </w:rPr>
-        <w:t>Full design control, but slow, costly, few models — weak ensembles, hand-picked look.</w:t>
+        <w:t>Full control over scenario design, but slow, costly, and yields few models — weak ensembles and a perception of hand-picked evidence.</w:t>
       </w:r>
     </w:p>
     <w:p>
@@ -118,7 +147,7 @@
         <w:rPr>
           <w:sz w:val="18"/>
         </w:rPr>
-        <w:t>IAM and sectoral teams submit economy-wide or sectoral EU scenarios directly to the MethodHub — best breadth and freshness at the lowest cost; the other options stay as complements.</w:t>
+        <w:t>Invite IAM and sectoral modelling teams to submit economy-wide or sectoral EU scenarios directly to the MethodHub. Best ensemble breadth and freshness at the lowest cost; the other two options remain available as fallback and complement.</w:t>
       </w:r>
     </w:p>
     <w:p>
@@ -129,7 +158,7 @@
       <w:r>
         <w:drawing>
           <wp:inline xmlns:a="http://schemas.openxmlformats.org/drawingml/2006/main" xmlns:pic="http://schemas.openxmlformats.org/drawingml/2006/picture">
-            <wp:extent cx="5832000" cy="4165714"/>
+            <wp:extent cx="5580000" cy="5898857"/>
             <wp:docPr id="1" name="Picture 1"/>
             <wp:cNvGraphicFramePr>
               <a:graphicFrameLocks noChangeAspect="1"/>
@@ -150,7 +179,7 @@
                   <pic:spPr>
                     <a:xfrm>
                       <a:off x="0" y="0"/>
-                      <a:ext cx="5832000" cy="4165714"/>
+                      <a:ext cx="5580000" cy="5898857"/>
                     </a:xfrm>
                     <a:prstGeom prst="rect"/>
                   </pic:spPr>
@@ -172,7 +201,7 @@
           <w:color w:val="555B63"/>
           <w:sz w:val="15"/>
         </w:rPr>
-        <w:t>Figure 1 | Current (a) vs new (b) assessment logic (schematic). Shaded band: range across submitted scenarios; solid line: ensemble median.</w:t>
+        <w:t>Figure 1 | The two purposes of the call (schematic). a, Current assessment logic. b, The submitted ensemble (band: range; line: median) makes official projections and EC benchmarks testable. c, Sectoral submissions reveal the changing composition of the remaining effort — from mature-technology roll-out to structural and societal change.</w:t>
       </w:r>
     </w:p>
     <w:p>
@@ -217,13 +246,13 @@
           <w:b/>
           <w:sz w:val="18"/>
         </w:rPr>
-        <w:t xml:space="preserve">Panel b (with the call) — </w:t>
+        <w:t xml:space="preserve">Panel b (checking &amp; context) — </w:t>
       </w:r>
       <w:r>
         <w:rPr>
           <w:sz w:val="18"/>
         </w:rPr>
-        <w:t>Both elements are kept, but the submitted scenario ensemble is added alongside: the shaded band is the range across all submitted runs, the solid line their median. Where the official projections and benchmarks sit relative to the band shows at a glance whether they are optimistic or conservative against the scientific landscape — and the ensemble reveals futures (such as deeper-than-target cuts) that a single official trajectory never shows.</w:t>
+        <w:t>Both elements are kept, but the submitted scenario ensemble is added alongside: the shaded band is the range across all submitted runs, the solid line their median. Where the official projections and benchmarks sit relative to the band shows at a glance whether they are optimistic or conservative against the scientific landscape.</w:t>
       </w:r>
     </w:p>
     <w:p>
@@ -236,13 +265,13 @@
           <w:b/>
           <w:sz w:val="18"/>
         </w:rPr>
-        <w:t xml:space="preserve">Why it matters — </w:t>
+        <w:t xml:space="preserve">Panel c (transition dynamics) — </w:t>
       </w:r>
       <w:r>
         <w:rPr>
           <w:sz w:val="18"/>
         </w:rPr>
-        <w:t>The same comparison is repeated per indicator on the matched flow chart, giving every sector benchmark an independent, scientifically robust corridor — and a documented basis for judging whether EC scenarios are too optimistic or too pessimistic on specific points.</w:t>
+        <w:t>Hitting a near-term target says little about the road beyond it: the share of remaining effort that mature technologies can deliver shrinks over time, while the hard core — technology availability limits, infrastructure, diets, consumption, demand — grows. Sectoral-model submissions resolve this split per sector, bottom-up, beyond the GHG headline.</w:t>
       </w:r>
     </w:p>
     <w:p>
@@ -274,7 +303,7 @@
         <w:rPr>
           <w:sz w:val="18"/>
         </w:rPr>
-        <w:t>Built on the MethodHub, which already bundles the scenario snapshot and the indicator database; teams submit IAMC-template files through a portal — no new platform needed.</w:t>
+        <w:t>Built on the MethodHub, which already bundles a Scenario Explorer snapshot (63 EU27 runs from 9 model versions) and the indicator database. Teams submit IAMC-template files through a portal; no new platform is needed.</w:t>
       </w:r>
     </w:p>
     <w:p>
@@ -293,7 +322,7 @@
         <w:rPr>
           <w:sz w:val="18"/>
         </w:rPr>
-        <w:t>A prototype flow chart ('Scenario call') already maps every indicator — mitigation and adaptation — to a template variable and submission track; submitted runs resolve against it automatically.</w:t>
+        <w:t>Each submitted run is resolved against the indicator framework — a prototype flow chart ('Scenario call — IAM-matched indicators') already maps every indicator of the default board to an IAMC variable and submission track (economy-wide / sectoral / new variable requested).</w:t>
       </w:r>
     </w:p>
     <w:p>
@@ -312,7 +341,7 @@
         <w:rPr>
           <w:sz w:val="18"/>
         </w:rPr>
-        <w:t>Vetting, filtering and corridor analysis run in the existing MethodHub pipeline (harmonisation diagnostics as used for the current snapshot).</w:t>
+        <w:t>A fully-fledged vetting, filtering and corridor-analysis toolset is built into the MethodHub pipeline (harmonisation diagnostics as used for the existing snapshot), so screening submissions is largely automatic.</w:t>
       </w:r>
     </w:p>
     <w:p>
@@ -331,7 +360,7 @@
         <w:rPr>
           <w:sz w:val="18"/>
         </w:rPr>
-        <w:t>The main genuine effort. With Keywan Riahi (MESSAGEix-GLOBIOM, IIASA) and Detlef van Vuuren (IMAGE, PBL) on the board, the call travels through the IAMC, ECEMF and NAVIGATE/ENGAGE networks at essentially no cost and with high credibility.</w:t>
+        <w:t>The main genuine effort. With two leading IAM modellers on the board — Keywan Riahi (MESSAGEix-GLOBIOM, IIASA) and Detlef van Vuuren (IMAGE, PBL) — the call travels through the IAMC, ECEMF and NAVIGATE/ENGAGE networks at essentially no cost and with high credibility.</w:t>
       </w:r>
     </w:p>
     <w:p>
@@ -357,13 +386,13 @@
           <w:b/>
           <w:sz w:val="18"/>
         </w:rPr>
-        <w:t xml:space="preserve">Quantified, independent monitoring — </w:t>
+        <w:t xml:space="preserve">Quantified monitoring — </w:t>
       </w:r>
       <w:r>
         <w:rPr>
           <w:sz w:val="18"/>
         </w:rPr>
-        <w:t>Every indicator gains a scenario corridor, and EC scenarios can be assessed against the broader scientific landscape (see figure).</w:t>
+        <w:t>Every indicator gains a scenario corridor; assessments shift from directional to quantitative, continuously refreshable.</w:t>
       </w:r>
     </w:p>
     <w:p>
@@ -376,13 +405,51 @@
           <w:b/>
           <w:sz w:val="18"/>
         </w:rPr>
-        <w:t xml:space="preserve">Broader, fresher evidence at low cost — </w:t>
+        <w:t xml:space="preserve">Transition dynamics, bottom-up — </w:t>
       </w:r>
       <w:r>
         <w:rPr>
           <w:sz w:val="18"/>
         </w:rPr>
-        <w:t>An open multi-team ensemble beats any single study; sectoral submissions fill IAM blind spots (renovation rates, mode shares, livestock intensities); tooling is an extension of existing infrastructure.</w:t>
+        <w:t>Sectoral submissions show how much of the remaining effort still rests on mature-technology roll-out versus hard structural and societal change — so early target-hitting cannot hide a hard residual.</w:t>
+      </w:r>
+    </w:p>
+    <w:p>
+      <w:pPr>
+        <w:pStyle w:val="ListBullet"/>
+        <w:spacing w:after="20"/>
+      </w:pPr>
+      <w:r>
+        <w:rPr>
+          <w:b/>
+          <w:sz w:val="18"/>
+        </w:rPr>
+        <w:t xml:space="preserve">Broader, fresher evidence — </w:t>
+      </w:r>
+      <w:r>
+        <w:rPr>
+          <w:sz w:val="18"/>
+        </w:rPr>
+        <w:t>An open ensemble across many teams beats any single commissioned study; sectoral submissions (fleet, building-stock, agro-economic models) fill known IAM blind spots such as renovation rates, mode shares and livestock intensities.</w:t>
+      </w:r>
+    </w:p>
+    <w:p>
+      <w:pPr>
+        <w:pStyle w:val="ListBullet"/>
+        <w:spacing w:after="20"/>
+      </w:pPr>
+      <w:r>
+        <w:rPr>
+          <w:b/>
+          <w:sz w:val="18"/>
+        </w:rPr>
+        <w:t xml:space="preserve">Low marginal cost — </w:t>
+      </w:r>
+      <w:r>
+        <w:rPr>
+          <w:sz w:val="18"/>
+        </w:rPr>
+        <w:t>Tooling is an extension of existing MethodHub infrastructure; modellers' incentive is visibility of their scenarios in advisory-board assessments.</w:t>
       </w:r>
     </w:p>
     <w:p>
@@ -401,7 +468,7 @@
         <w:rPr>
           <w:sz w:val="18"/>
         </w:rPr>
-        <w:t>A documented open call with published criteria strengthens the board's independence over ad-hoc scenario selection.</w:t>
+        <w:t>A documented, open call with published criteria strengthens the board's independence compared with selecting scenarios ad hoc.</w:t>
       </w:r>
     </w:p>
     <w:p>
@@ -414,7 +481,7 @@
           <w:color w:val="2F6E5B"/>
           <w:sz w:val="20"/>
         </w:rPr>
-        <w:t>Risks — and why they are manageable</w:t>
+        <w:t>Risks</w:t>
       </w:r>
     </w:p>
     <w:p>
@@ -433,7 +500,7 @@
         <w:rPr>
           <w:sz w:val="18"/>
         </w:rPr>
-        <w:t>The central risk — mitigated by network distribution, a low submission burden (standard IAMC template), and seeding with the 63 runs already held so the tool works from day one.</w:t>
+        <w:t>The central risk. Mitigated by the board's network distribution, a low submission burden (standard IAMC template), and seeding the database with the 63 runs we already hold so the tool is useful from day one.</w:t>
       </w:r>
     </w:p>
     <w:p>
@@ -452,7 +519,7 @@
         <w:rPr>
           <w:sz w:val="18"/>
         </w:rPr>
-        <w:t>Automated vetting and harmonisation diagnostics plus published inclusion criteria; submission does not imply endorsement.</w:t>
+        <w:t>Mitigated by automated vetting and harmonisation diagnostics, plus published inclusion criteria; submission does not imply endorsement.</w:t>
       </w:r>
     </w:p>
     <w:p>
@@ -471,7 +538,26 @@
         <w:rPr>
           <w:sz w:val="18"/>
         </w:rPr>
-        <w:t>Non-standard outputs (circular material use, food waste, renovation equity) are flagged as requested variables; the sectoral and impact-model tracks recruit the teams that can report them.</w:t>
+        <w:t>Some indicators (circular material use, food waste, first-generation biofuel shares) are not standard outputs; the call flags them as requested variables and the sectoral track recruits the models that can report them.</w:t>
+      </w:r>
+    </w:p>
+    <w:p>
+      <w:pPr>
+        <w:pStyle w:val="ListBullet"/>
+        <w:spacing w:after="20"/>
+      </w:pPr>
+      <w:r>
+        <w:rPr>
+          <w:b/>
+          <w:sz w:val="18"/>
+        </w:rPr>
+        <w:t xml:space="preserve">Process cost — </w:t>
+      </w:r>
+      <w:r>
+        <w:rPr>
+          <w:sz w:val="18"/>
+        </w:rPr>
+        <w:t>Concentrated in distribution and follow-up rather than in engineering — a bounded, plannable effort for the secretariat.</w:t>
       </w:r>
     </w:p>
     <w:p>
@@ -493,7 +579,7 @@
           <w:i w:val="0"/>
           <w:sz w:val="18"/>
         </w:rPr>
-        <w:t>Feasible with modest effort: infrastructure and analysis tooling are deliverable on the MethodHub, indicator matching exists in prototype, and the one real success factor — that teams submit — is where the board is strongest, through Keywan's and Detlef's networks. We propose preparing a pilot call for autumn 2026.</w:t>
+        <w:t>The call is feasible with modest effort: the infrastructure and analysis tooling can be delivered on the MethodHub, the indicator matching already exists in prototype, and the one real success factor — that teams actually submit — is exactly where the board is strongest, through Keywan's and Detlef's networks. We propose preparing a pilot call for autumn 2026.</w:t>
       </w:r>
     </w:p>
     <w:sectPr>

</xml_diff>

<commit_message>
Add sectoral zoom row (d1-d3) to scenario-call figure
Below panel c, three mini-panels zoom into the hard core with one
sectoral-model example per sector: d1 industry (electrolyser capacity
gap vs required pathway), d2 transport (biofuel demand vs sustainable
biomass supply from land-use models, cross-sector competition), d3
buildings (heat-pump roll-out slowed by the old unrenovated stock).
Y-axis of panels a-c simplified to plain GHG emissions. Caption and
explainer extended with a d1-d3 bullet.

https://claude.ai/code/session_017E2LLU51vN56wQXoUnM1vJ
</commit_message>
<xml_diff>
--- a/project-documents/2026-06-12 Scenario Submission Call - One-pager.docx
+++ b/project-documents/2026-06-12 Scenario Submission Call - One-pager.docx
@@ -158,7 +158,7 @@
       <w:r>
         <w:drawing>
           <wp:inline xmlns:a="http://schemas.openxmlformats.org/drawingml/2006/main" xmlns:pic="http://schemas.openxmlformats.org/drawingml/2006/picture">
-            <wp:extent cx="5580000" cy="5898857"/>
+            <wp:extent cx="5580000" cy="7413429"/>
             <wp:docPr id="1" name="Picture 1"/>
             <wp:cNvGraphicFramePr>
               <a:graphicFrameLocks noChangeAspect="1"/>
@@ -179,7 +179,7 @@
                   <pic:spPr>
                     <a:xfrm>
                       <a:off x="0" y="0"/>
-                      <a:ext cx="5580000" cy="5898857"/>
+                      <a:ext cx="5580000" cy="7413429"/>
                     </a:xfrm>
                     <a:prstGeom prst="rect"/>
                   </pic:spPr>
@@ -201,7 +201,7 @@
           <w:color w:val="555B63"/>
           <w:sz w:val="15"/>
         </w:rPr>
-        <w:t>Figure 1 | The two purposes of the call (schematic). a, Current assessment logic. b, The submitted ensemble (band: range; line: median) makes official projections and EC benchmarks testable. c, Sectoral submissions reveal the changing composition of the remaining effort — from mature-technology roll-out to structural and societal change.</w:t>
+        <w:t>Figure 1 | The two purposes of the call (schematic). a, Current assessment logic. b, The submitted ensemble (band: range; line: median) makes official projections and EC benchmarks testable. c, The gap to the net-zero pathway is closed first by mature-technology roll-out, later by structural and societal change. d1–d3, zooming into that hard core with one sectoral-model example per sector: the industry electrolyser capacity gap, transport biomass demand vs sustainable availability, and buildings heat-pump roll-out slowed by the old, unrenovated stock.</w:t>
       </w:r>
     </w:p>
     <w:p>
@@ -272,6 +272,25 @@
           <w:sz w:val="18"/>
         </w:rPr>
         <w:t>Hitting a near-term target says little about the road beyond it. The gap between the current-effort baseline and the net-zero pathway is small in 2030 and closed mostly by mature-technology roll-out — the low-hanging fruit, which delivers early and then saturates. The much larger 2050 gap must come from the hard core: structural and societal change (technology availability limits, infrastructure, diets, consumption, demand). Sectoral-model submissions resolve this split per sector, bottom-up, beyond the GHG headline.</w:t>
+      </w:r>
+    </w:p>
+    <w:p>
+      <w:pPr>
+        <w:pStyle w:val="ListBullet"/>
+        <w:spacing w:after="20"/>
+      </w:pPr>
+      <w:r>
+        <w:rPr>
+          <w:b/>
+          <w:sz w:val="18"/>
+        </w:rPr>
+        <w:t xml:space="preserve">Panels d1–d3 (the sectoral zoom) — </w:t>
+      </w:r>
+      <w:r>
+        <w:rPr>
+          <w:sz w:val="18"/>
+        </w:rPr>
+        <w:t>One example per sector of the detailed outputs we want submitted: industry — the gap between the current electrolyser deployment trend and what pathways require; transport — biofuel demand running into the sustainable biomass supply that land-use models can certify, with competition across sectors; buildings — the heat-pump roll-out required versus a trend slowed by the old, unrenovated stock. This is the 'reading between the lines': each panel turns an invisible structural constraint into a measurable gap.</w:t>
       </w:r>
     </w:p>
     <w:p>

</xml_diff>

<commit_message>
Panel c as sector-split pathway with magnifier links to d1-d3
- Panel c now decomposes the net-zero pathway into stacked sector
  wedges scaled to today's approximate EU27 emission shares (EEA
  inventory: energy supply 26%, transport 24%, industry 20%, buildings
  13%, agriculture 11%, waste & other 6%), with differing decline
  speeds so the remaining-emissions composition shifts over time
- Magnifying-glass lenses over industry, transport and buildings,
  connected by dotted leaders to the d1-d3 zoom panels; the 'd ·'
  headline row is removed
- Vertical margin brackets group the panels: 'CURRENT LOGIC' beside
  panel a, 'NEW LOGIC — WHAT THE SCENARIO CALL ADDS' spanning b-d;
  panel c title rephrased to continue from b
- Label collision fixes (today line vs d2 supply label)
- One-pager caption and panel c/d explainer bullets rewritten to match

https://claude.ai/code/session_017E2LLU51vN56wQXoUnM1vJ
</commit_message>
<xml_diff>
--- a/project-documents/2026-06-12 Scenario Submission Call - One-pager.docx
+++ b/project-documents/2026-06-12 Scenario Submission Call - One-pager.docx
@@ -201,7 +201,7 @@
           <w:color w:val="555B63"/>
           <w:sz w:val="15"/>
         </w:rPr>
-        <w:t>Figure 1 | The two purposes of the call (schematic). a, Current assessment logic. b, The submitted ensemble (band: range; line: median) makes official projections and EC benchmarks testable. c, The gap to the net-zero pathway is closed first by mature-technology roll-out, later by structural and societal change. d1–d3, zooming into that hard core with one sectoral-model example per sector: the industry electrolyser capacity gap, transport biomass demand vs sustainable availability, and buildings heat-pump roll-out slowed by the old, unrenovated stock.</w:t>
+        <w:t>Figure 1 | Current vs new assessment logic (schematic). a, Current logic: official projections and EC benchmarks only. b–d, the new logic the scenario call enables. b, The submitted ensemble (band: range; line: median) makes official projections and EC benchmarks testable. c, The same pathway split into sectors, scaled to today's approximate EU27 emission shares (EEA inventory); the magnifiers mark the sectors zoomed below. d1–d3, what the magnifiers reveal — one sectoral-model output per sector: the industry electrolyser capacity gap, transport biofuel demand vs sustainable biomass availability, and buildings heat-pump roll-out slowed by the old, unrenovated stock.</w:t>
       </w:r>
     </w:p>
     <w:p>
@@ -265,13 +265,13 @@
           <w:b/>
           <w:sz w:val="18"/>
         </w:rPr>
-        <w:t xml:space="preserve">Panel c (transition dynamics) — </w:t>
+        <w:t xml:space="preserve">Panel c (the sector split — part of the new logic) — </w:t>
       </w:r>
       <w:r>
         <w:rPr>
           <w:sz w:val="18"/>
         </w:rPr>
-        <w:t>Hitting a near-term target says little about the road beyond it. The gap between the current-effort baseline and the net-zero pathway is small in 2030 and closed mostly by mature-technology roll-out — the low-hanging fruit, which delivers early and then saturates. The much larger 2050 gap must come from the hard core: structural and societal change (technology availability limits, infrastructure, diets, consumption, demand). Sectoral-model submissions resolve this split per sector, bottom-up, beyond the GHG headline.</w:t>
+        <w:t>The headline pathway is the sum of very different sector transitions. Splitting it by today's actual emission shares (energy supply ~26%, transport ~24%, industry ~20%, buildings ~13%, agriculture ~11%, waste &amp; other ~6%) shows the composition of remaining emissions shifting over time — energy decarbonises fastest, agriculture and transport linger. The magnifying glasses mark where we zoom in.</w:t>
       </w:r>
     </w:p>
     <w:p>
@@ -284,7 +284,7 @@
           <w:b/>
           <w:sz w:val="18"/>
         </w:rPr>
-        <w:t xml:space="preserve">Panels d1–d3 (the sectoral zoom) — </w:t>
+        <w:t xml:space="preserve">Panels d1–d3 (under the magnifier — also part of the new logic) — </w:t>
       </w:r>
       <w:r>
         <w:rPr>

</xml_diff>

<commit_message>
Rename figure groupings: Policy Gap 1.0 logic vs proposed new logic
Bracket labels and panel a/b titles renamed ('POLICY GAP 1.0 LOGIC' /
'PROPOSED NEW LOGIC — WHAT THE SCENARIO CALL ADDS'); one-pager caption
and explainer bullets updated to match.

https://claude.ai/code/session_017E2LLU51vN56wQXoUnM1vJ
</commit_message>
<xml_diff>
--- a/project-documents/2026-06-12 Scenario Submission Call - One-pager.docx
+++ b/project-documents/2026-06-12 Scenario Submission Call - One-pager.docx
@@ -201,7 +201,7 @@
           <w:color w:val="555B63"/>
           <w:sz w:val="15"/>
         </w:rPr>
-        <w:t>Figure 1 | Current vs new assessment logic (schematic). a, Current logic: official projections and EC benchmarks only. b–d, the new logic the scenario call enables. b, The submitted ensemble (band: range; line: median) makes official projections and EC benchmarks testable. c, The same pathway split into sectors, scaled to today's approximate EU27 emission shares (EEA inventory); the magnifiers mark the sectors zoomed below. d1–d3, what the magnifiers reveal — one sectoral-model output per sector: the industry electrolyser capacity gap, transport biofuel demand vs sustainable biomass availability, and buildings heat-pump roll-out slowed by the old, unrenovated stock.</w:t>
+        <w:t>Figure 1 | Policy Gap 1.0 logic vs the proposed new logic (schematic). a, Policy Gap 1.0 logic: official projections and EC benchmarks only. b–d, the proposed new logic the scenario call enables. b, The submitted ensemble (band: range; line: median) makes official projections and EC benchmarks testable. c, The same pathway split into sectors, scaled to today's approximate EU27 emission shares (EEA inventory); the magnifiers mark the sectors zoomed below. d1–d3, what the magnifiers reveal — one sectoral-model output per sector: the industry electrolyser capacity gap, transport biofuel demand vs sustainable biomass availability, and buildings heat-pump roll-out slowed by the old, unrenovated stock.</w:t>
       </w:r>
     </w:p>
     <w:p>
@@ -227,7 +227,7 @@
           <w:b/>
           <w:sz w:val="18"/>
         </w:rPr>
-        <w:t xml:space="preserve">Panel a (today) — </w:t>
+        <w:t xml:space="preserve">Panel a (Policy Gap 1.0 logic) — </w:t>
       </w:r>
       <w:r>
         <w:rPr>
@@ -265,7 +265,7 @@
           <w:b/>
           <w:sz w:val="18"/>
         </w:rPr>
-        <w:t xml:space="preserve">Panel c (the sector split — part of the new logic) — </w:t>
+        <w:t xml:space="preserve">Panel c (the sector split — part of the proposed new logic) — </w:t>
       </w:r>
       <w:r>
         <w:rPr>
@@ -284,7 +284,7 @@
           <w:b/>
           <w:sz w:val="18"/>
         </w:rPr>
-        <w:t xml:space="preserve">Panels d1–d3 (under the magnifier — also part of the new logic) — </w:t>
+        <w:t xml:space="preserve">Panels d1–d3 (under the magnifier — also part of the proposed new logic) — </w:t>
       </w:r>
       <w:r>
         <w:rPr>

</xml_diff>

<commit_message>
Add recurring/institutional benefit to one-pager
New Benefits bullet: the recurring progress report enables a recurring
modelling call per assessment cycle, institutionalising the call so it
strengthens the board's standing in the modelling community and serves
the stakeholder-engagement strategy as a transparent, structured
channel to interact with the board and contribute work.

https://claude.ai/code/session_017E2LLU51vN56wQXoUnM1vJ
</commit_message>
<xml_diff>
--- a/project-documents/2026-06-12 Scenario Submission Call - One-pager.docx
+++ b/project-documents/2026-06-12 Scenario Submission Call - One-pager.docx
@@ -492,6 +492,25 @@
     </w:p>
     <w:p>
       <w:pPr>
+        <w:pStyle w:val="ListBullet"/>
+        <w:spacing w:after="20"/>
+      </w:pPr>
+      <w:r>
+        <w:rPr>
+          <w:b/>
+          <w:sz w:val="18"/>
+        </w:rPr>
+        <w:t xml:space="preserve">Recurring and institutional — </w:t>
+      </w:r>
+      <w:r>
+        <w:rPr>
+          <w:sz w:val="18"/>
+        </w:rPr>
+        <w:t>The recurring progress report allows a recurring modelling call: each assessment cycle opens with a call whose submissions inform all work of that cycle. Institutionalised this way, the call strengthens the advisory board's standing in the modelling community and becomes a pillar of the stakeholder-engagement strategy — a transparent, structured channel for researchers to interact with the board and contribute work.</w:t>
+      </w:r>
+    </w:p>
+    <w:p>
+      <w:pPr>
         <w:spacing w:before="80" w:after="20"/>
       </w:pPr>
       <w:r>

</xml_diff>